<commit_message>
docs: update master plan, syllabi, quiz guide and rebuild log
</commit_message>
<xml_diff>
--- a/IUEA_Teaching_Plan/IUEA_ML_Syllabus_CohortA_Design_and_Infrastructure.docx
+++ b/IUEA_Teaching_Plan/IUEA_ML_Syllabus_CohortA_Design_and_Infrastructure.docx
@@ -4216,7 +4216,7 @@
                 <w:rFonts w:ascii="Calibri" w:hAnsi="Calibri"/>
                 <w:sz w:val="17"/>
               </w:rPr>
-              <w:t>A five-minute quiz of five multiple-choice questions on your phone, auto-marked with immediate feedback. From Week 8 the quizzes of three classes are taken together in one sitting (Block 1: Q7 to Q9; Block 2: Q10 to Q12), each form open for 24 hours. Best 4 of the six weekly quizzes count; both blocks always count. The total is 50 marks and the component is worth 10%.</w:t>
+              <w:t>A five-minute quiz of five multiple-choice questions on your phone, auto-marked with immediate feedback. From Week 8 the quizzes of three classes are taken together in one sitting (Block 1: Q7 to Q9; Block 2: Q10 to Q12), each form open for 24 hours. Week 6 is not assigned, so the best 3 of the five weekly quizzes count; both blocks always count. The total is 45 marks and the component is worth 10%.</w:t>
             </w:r>
           </w:p>
         </w:tc>
@@ -4339,7 +4339,7 @@
                 <w:rFonts w:ascii="Calibri" w:hAnsi="Calibri"/>
                 <w:sz w:val="17"/>
               </w:rPr>
-              <w:t>Best 4 of the six weekly assignments count. Block 1 is three parts (A7, A8, A9) and Block 2 is two parts (A10, A11); each part uses the same assignment form as before, and a part not submitted scores zero. Both blocks always count. The total is 180 marks and the component is worth 10%. Upload the required notebook and report through the assignment form. Visible checks provide practice feedback; final marks use the submitted files.</w:t>
+              <w:t>Week 6 is not assigned, so the best 3 of the five weekly assignments count. Block 1 is three parts (A7, A8, A9) and Block 2 is two parts (A10, A11); each part uses the same assignment form as before, and a part not submitted scores zero. Both blocks always count. The total is 160 marks and the component is worth 10%. Upload the required notebook and report through the assignment form. Visible checks provide practice feedback; final marks use the submitted files.</w:t>
             </w:r>
           </w:p>
         </w:tc>

</xml_diff>